<commit_message>
refactor(routing_algorithms): extract print helpers and drop unused output override
- Extract distance/path/summary printing in dijkstra_example.py into
  print_distances, print_path_summary, print_summary, and print_disclaimer
  helpers, simplifying main()
- Convert inline triple-quoted string comments into regular comments
- Remove unused OUTPUT_PATH override in graph_draw/graph.py, always deriving
  the output path from CENTER_STOP_ID
- Document graph_draw/graph.py usage and configuration constants in README.md
</commit_message>
<xml_diff>
--- a/.meetings/26.06.30.docx
+++ b/.meetings/26.06.30.docx
@@ -210,6 +210,114 @@
           <w:rFonts w:ascii="Arial" w:hAnsi="Arial" w:cs="Arial"/>
         </w:rPr>
         <w:t>Barreja dels tres pesos també</w:t>
+      </w:r>
+    </w:p>
+    <w:p>
+      <w:pPr>
+        <w:pStyle w:val="ListParagraph"/>
+        <w:numPr>
+          <w:ilvl w:val="0"/>
+          <w:numId w:val="1"/>
+        </w:numPr>
+        <w:rPr>
+          <w:rFonts w:ascii="Arial" w:hAnsi="Arial" w:cs="Arial"/>
+        </w:rPr>
+      </w:pPr>
+      <w:r>
+        <w:rPr>
+          <w:rFonts w:ascii="Arial" w:hAnsi="Arial" w:cs="Arial"/>
+        </w:rPr>
+        <w:t>Creat folder now de routing_algorithms</w:t>
+      </w:r>
+    </w:p>
+    <w:p>
+      <w:pPr>
+        <w:pStyle w:val="ListParagraph"/>
+        <w:numPr>
+          <w:ilvl w:val="0"/>
+          <w:numId w:val="1"/>
+        </w:numPr>
+        <w:rPr>
+          <w:rFonts w:ascii="Arial" w:hAnsi="Arial" w:cs="Arial"/>
+        </w:rPr>
+      </w:pPr>
+      <w:r>
+        <w:rPr>
+          <w:rFonts w:ascii="Arial" w:hAnsi="Arial" w:cs="Arial"/>
+        </w:rPr>
+        <w:t>routing_algotithms/graph_draw/graph.py</w:t>
+      </w:r>
+      <w:r>
+        <w:rPr>
+          <w:rFonts w:ascii="Arial" w:hAnsi="Arial" w:cs="Arial"/>
+        </w:rPr>
+        <w:t xml:space="preserve"> </w:t>
+      </w:r>
+      <w:r>
+        <w:rPr>
+          <w:rFonts w:ascii="Arial" w:hAnsi="Arial" w:cs="Arial"/>
+        </w:rPr>
+        <w:sym w:font="Wingdings" w:char="F0DF"/>
+      </w:r>
+      <w:r>
+        <w:rPr>
+          <w:rFonts w:ascii="Arial" w:hAnsi="Arial" w:cs="Arial"/>
+        </w:rPr>
+        <w:t xml:space="preserve"> graf millorable però de moment el deixo així</w:t>
+      </w:r>
+    </w:p>
+    <w:p>
+      <w:pPr>
+        <w:pStyle w:val="ListParagraph"/>
+        <w:numPr>
+          <w:ilvl w:val="0"/>
+          <w:numId w:val="1"/>
+        </w:numPr>
+        <w:rPr>
+          <w:rFonts w:ascii="Arial" w:hAnsi="Arial" w:cs="Arial"/>
+        </w:rPr>
+      </w:pPr>
+      <w:r>
+        <w:rPr>
+          <w:rFonts w:ascii="Arial" w:hAnsi="Arial" w:cs="Arial"/>
+        </w:rPr>
+        <w:t>routing_algotithms/dijkstra/dijkstra_example.py</w:t>
+      </w:r>
+    </w:p>
+    <w:p>
+      <w:pPr>
+        <w:pStyle w:val="ListParagraph"/>
+        <w:numPr>
+          <w:ilvl w:val="1"/>
+          <w:numId w:val="1"/>
+        </w:numPr>
+        <w:rPr>
+          <w:rFonts w:ascii="Arial" w:hAnsi="Arial" w:cs="Arial"/>
+        </w:rPr>
+      </w:pPr>
+      <w:r>
+        <w:rPr>
+          <w:rFonts w:ascii="Arial" w:hAnsi="Arial" w:cs="Arial"/>
+        </w:rPr>
+        <w:t>Com compararem els temps d’execució si executant el dijkstra diferents vegades em dona nombres diferents?</w:t>
+      </w:r>
+    </w:p>
+    <w:p>
+      <w:pPr>
+        <w:pStyle w:val="ListParagraph"/>
+        <w:numPr>
+          <w:ilvl w:val="2"/>
+          <w:numId w:val="1"/>
+        </w:numPr>
+        <w:rPr>
+          <w:rFonts w:ascii="Arial" w:hAnsi="Arial" w:cs="Arial"/>
+        </w:rPr>
+      </w:pPr>
+      <w:r>
+        <w:rPr>
+          <w:rFonts w:ascii="Arial" w:hAnsi="Arial" w:cs="Arial"/>
+        </w:rPr>
+        <w:t>Faig diferentes runs i faig la mitjana?</w:t>
       </w:r>
     </w:p>
     <w:sectPr>

</xml_diff>